<commit_message>
docs(report5): rebuild and reconcile report counts and evidence
</commit_message>
<xml_diff>
--- a/docs/report5/deliverables/Report5_Test Documentation.docx
+++ b/docs/report5/deliverables/Report5_Test Documentation.docx
@@ -4017,7 +4017,7 @@
           <w:color w:val="000000"/>
           <w:sz w:val="22"/>
         </w:rPr>
-        <w:t>Other cases: Report5_Test Report.xlsx — 87 entries: 21 integration cases (including three skipped placeholders), four local NFR scenarios and 62 planned system/E2E/state scenarios. It also contains the feature inventory, workflows, 40-use-case RTM, unit traceability and defect register.</w:t>
+        <w:t>Other cases: Report5_Test Report.xlsx — 87 entries: 21 Passed / 1 Failed / 65 Not Tested. The inventory includes 21 integration cases (three skipped), four local NFR scenarios and 62 planned system/E2E/state scenarios. The four local checks are measured against a proposed criterion, not SRS acceptance. The workbook also contains the feature inventory, workflows, 40-use-case RTM, unit traceability and defect register.</w:t>
       </w:r>
     </w:p>
     <w:p>
@@ -4067,7 +4067,7 @@
           <w:color w:val="000000"/>
           <w:sz w:val="22"/>
         </w:rPr>
-        <w:t>Evidence paths are relative to docs/report5: evidence/unit.trx, evidence/integration.trx, evidence/unit-coverage.cobertura.xml and evidence/nfr-local.json. The successful measurement TRX is under evidence/nfr-verified. The initial NFR warmup failure was a test-fixture configuration issue and is not a product defect. The fixture was corrected without changing business code.</w:t>
+        <w:t>Evidence paths are relative to docs/report5: evidence/unit.trx, evidence/integration.trx, evidence/unit-coverage.cobertura.xml and evidence/nfr-local.json. The measurement TRX under evidence/nfr-verified is local-only and is not included in the committed evidence package. The initial NFR warmup failure was a test-fixture configuration issue and is not a product defect. The fixture was corrected without changing business code.</w:t>
       </w:r>
     </w:p>
     <w:p>

</xml_diff>

<commit_message>
test(report5): checkpoint planned API evidence and reconciled reports
</commit_message>
<xml_diff>
--- a/docs/report5/deliverables/Report5_Test Documentation.docx
+++ b/docs/report5/deliverables/Report5_Test Documentation.docx
@@ -1548,7 +1548,7 @@
           <w:color w:val="000000"/>
           <w:sz w:val="22"/>
         </w:rPr>
-        <w:t>This report documents the test scope, strategy, execution evidence and remaining risks for SmartLibrary. The baseline unit suite passed 203 cases; API integration passed 17, failed 1 and skipped 3. The failed registration-state transition remains open. These results do not establish release readiness or full mandatory-feature acceptance.</w:t>
+        <w:t>This report documents the test scope, strategy, execution evidence and remaining risks for SmartLibrary. The baseline unit suite passed 203 cases; baseline API integration passed 17, failed 1 and skipped 3. A targeted follow-up API run passed 22 and failed 2 of 24 tests. Registration-state and catalog authorization defects remain open. These results do not establish release readiness or full mandatory-feature acceptance.</w:t>
       </w:r>
     </w:p>
     <w:p>
@@ -3552,7 +3552,7 @@
           <w:color w:val="000000"/>
           <w:sz w:val="22"/>
         </w:rPr>
-        <w:t>The sequence is baseline/evidence preservation, local measurement, traceability and document preparation, then remaining system/provider tests, defect retest and acceptance. Official review dates have not been supplied.</w:t>
+        <w:t>The following feature-based testing schedule is planned for 27–31 October 2026. This common date range is a planning window authorized by HuyLong, not evidence that every feature has been executed. Actual execution dates and outcomes are recorded separately in the workbooks and TRX. Official review and submission dates remain to be confirmed.</w:t>
       </w:r>
     </w:p>
     <w:tbl>
@@ -3590,21 +3590,8 @@
           <w:p>
             <w:pPr>
               <w:keepNext w:val="0"/>
-              <w:spacing w:after="0" w:line="240" w:lineRule="auto"/>
-              <w:rPr>
-                <w:rFonts w:ascii="Arial" w:eastAsia="Times New Roman" w:hAnsi="Arial" w:cs="Arial"/>
-                <w:b/>
-                <w:bCs/>
-                <w:sz w:val="20"/>
-                <w:szCs w:val="20"/>
-                <w:lang w:val="en-US"/>
-              </w:rPr>
-            </w:pPr>
-            <w:r>
-              <w:rPr>
-                <w:b/>
-                <w:bCs/>
-              </w:rPr>
+            </w:pPr>
+            <w:r>
               <w:t>Milestone Task</w:t>
             </w:r>
           </w:p>
@@ -3619,25 +3606,8 @@
           <w:p>
             <w:pPr>
               <w:keepNext w:val="0"/>
-              <w:spacing w:after="0" w:line="240" w:lineRule="auto"/>
-              <w:jc w:val="center"/>
-              <w:rPr>
-                <w:rFonts w:ascii="Arial" w:eastAsia="Times New Roman" w:hAnsi="Arial" w:cs="Arial"/>
-                <w:b/>
-                <w:bCs/>
-                <w:sz w:val="20"/>
-                <w:szCs w:val="20"/>
-                <w:lang w:val="en-US"/>
-              </w:rPr>
-            </w:pPr>
-            <w:r>
-              <w:rPr>
-                <w:rFonts w:ascii="Arial" w:eastAsia="Times New Roman" w:hAnsi="Arial" w:cs="Arial"/>
-                <w:b/>
-                <w:bCs/>
-                <w:sz w:val="20"/>
-                <w:szCs w:val="20"/>
-              </w:rPr>
+            </w:pPr>
+            <w:r>
               <w:t>Start Date</w:t>
             </w:r>
           </w:p>
@@ -3650,24 +3620,8 @@
           <w:p>
             <w:pPr>
               <w:keepNext w:val="0"/>
-              <w:spacing w:after="0" w:line="240" w:lineRule="auto"/>
-              <w:jc w:val="center"/>
-              <w:rPr>
-                <w:rFonts w:ascii="Arial" w:eastAsia="Times New Roman" w:hAnsi="Arial" w:cs="Arial"/>
-                <w:b/>
-                <w:bCs/>
-                <w:sz w:val="20"/>
-                <w:szCs w:val="20"/>
-              </w:rPr>
-            </w:pPr>
-            <w:r>
-              <w:rPr>
-                <w:rFonts w:ascii="Arial" w:eastAsia="Times New Roman" w:hAnsi="Arial" w:cs="Arial"/>
-                <w:b/>
-                <w:bCs/>
-                <w:sz w:val="20"/>
-                <w:szCs w:val="20"/>
-              </w:rPr>
+            </w:pPr>
+            <w:r>
               <w:t>End Date</w:t>
             </w:r>
           </w:p>
@@ -3695,7 +3649,7 @@
                 <w:color w:val="000000"/>
                 <w:sz w:val="21"/>
               </w:rPr>
-              <w:t>Baseline and isolated tests</w:t>
+              <w:t>Sign Up</w:t>
             </w:r>
           </w:p>
         </w:tc>
@@ -3716,7 +3670,7 @@
                 <w:color w:val="000000"/>
                 <w:sz w:val="21"/>
               </w:rPr>
-              <w:t>2026-10-27</w:t>
+              <w:t>27-10-2026</w:t>
             </w:r>
           </w:p>
         </w:tc>
@@ -3735,7 +3689,7 @@
                 <w:color w:val="000000"/>
                 <w:sz w:val="21"/>
               </w:rPr>
-              <w:t>2026-10-27</w:t>
+              <w:t>31-10-2026</w:t>
             </w:r>
           </w:p>
         </w:tc>
@@ -3762,7 +3716,7 @@
                 <w:color w:val="000000"/>
                 <w:sz w:val="21"/>
               </w:rPr>
-              <w:t>Local API measurements and report preparation</w:t>
+              <w:t>Sign In</w:t>
             </w:r>
           </w:p>
         </w:tc>
@@ -3783,7 +3737,7 @@
                 <w:color w:val="000000"/>
                 <w:sz w:val="21"/>
               </w:rPr>
-              <w:t>2026-10-27</w:t>
+              <w:t>27-10-2026</w:t>
             </w:r>
           </w:p>
         </w:tc>
@@ -3802,7 +3756,7 @@
                 <w:color w:val="000000"/>
                 <w:sz w:val="21"/>
               </w:rPr>
-              <w:t>2026-10-27</w:t>
+              <w:t>31-10-2026</w:t>
             </w:r>
           </w:p>
         </w:tc>
@@ -3829,7 +3783,7 @@
                 <w:color w:val="000000"/>
                 <w:sz w:val="21"/>
               </w:rPr>
-              <w:t>Provider/browser tests and defect retest</w:t>
+              <w:t>Forgot Password</w:t>
             </w:r>
           </w:p>
         </w:tc>
@@ -3850,7 +3804,7 @@
                 <w:color w:val="000000"/>
                 <w:sz w:val="21"/>
               </w:rPr>
-              <w:t>Đợi HuyLong điền — planned start</w:t>
+              <w:t>27-10-2026</w:t>
             </w:r>
           </w:p>
         </w:tc>
@@ -3869,7 +3823,7 @@
                 <w:color w:val="000000"/>
                 <w:sz w:val="21"/>
               </w:rPr>
-              <w:t>Đợi HuyLong điền — planned end</w:t>
+              <w:t>31-10-2026</w:t>
             </w:r>
           </w:p>
         </w:tc>
@@ -3896,7 +3850,7 @@
                 <w:color w:val="000000"/>
                 <w:sz w:val="21"/>
               </w:rPr>
-              <w:t>Review 2 / Defense 1.1 / Report 5 submission</w:t>
+              <w:t>Search &amp; Discover Books</w:t>
             </w:r>
           </w:p>
         </w:tc>
@@ -3917,7 +3871,7 @@
                 <w:color w:val="000000"/>
                 <w:sz w:val="21"/>
               </w:rPr>
-              <w:t>Đợi HuyLong điền — official milestones</w:t>
+              <w:t>27-10-2026</w:t>
             </w:r>
           </w:p>
         </w:tc>
@@ -3936,7 +3890,2419 @@
                 <w:color w:val="000000"/>
                 <w:sz w:val="21"/>
               </w:rPr>
-              <w:t>Đợi HuyLong điền — submission deadline</w:t>
+              <w:t>31-10-2026</w:t>
+            </w:r>
+          </w:p>
+        </w:tc>
+      </w:tr>
+      <w:tr>
+        <w:trPr>
+          <w:trHeight w:val="264"/>
+          <w:cantSplit/>
+        </w:trPr>
+        <w:tc>
+          <w:tcPr>
+            <w:tcW w:w="4896" w:type="dxa"/>
+            <w:shd w:val="clear" w:color="auto" w:fill="auto"/>
+            <w:vAlign w:val="center"/>
+          </w:tcPr>
+          <w:p>
+            <w:pPr>
+              <w:keepNext w:val="0"/>
+            </w:pPr>
+            <w:r>
+              <w:rPr>
+                <w:rFonts w:ascii="Arial" w:hAnsi="Arial"/>
+                <w:i w:val="0"/>
+                <w:color w:val="000000"/>
+                <w:sz w:val="21"/>
+              </w:rPr>
+              <w:t>View Book Details</w:t>
+            </w:r>
+          </w:p>
+        </w:tc>
+        <w:tc>
+          <w:tcPr>
+            <w:tcW w:w="2088" w:type="dxa"/>
+            <w:shd w:val="clear" w:color="auto" w:fill="auto"/>
+            <w:vAlign w:val="center"/>
+          </w:tcPr>
+          <w:p>
+            <w:pPr>
+              <w:keepNext w:val="0"/>
+            </w:pPr>
+            <w:r>
+              <w:rPr>
+                <w:rFonts w:ascii="Arial" w:hAnsi="Arial"/>
+                <w:i w:val="0"/>
+                <w:color w:val="000000"/>
+                <w:sz w:val="21"/>
+              </w:rPr>
+              <w:t>27-10-2026</w:t>
+            </w:r>
+          </w:p>
+        </w:tc>
+        <w:tc>
+          <w:tcPr>
+            <w:tcW w:w="2088" w:type="dxa"/>
+          </w:tcPr>
+          <w:p>
+            <w:pPr>
+              <w:keepNext w:val="0"/>
+            </w:pPr>
+            <w:r>
+              <w:rPr>
+                <w:rFonts w:ascii="Arial" w:hAnsi="Arial"/>
+                <w:i w:val="0"/>
+                <w:color w:val="000000"/>
+                <w:sz w:val="21"/>
+              </w:rPr>
+              <w:t>31-10-2026</w:t>
+            </w:r>
+          </w:p>
+        </w:tc>
+      </w:tr>
+      <w:tr>
+        <w:trPr>
+          <w:trHeight w:val="264"/>
+          <w:cantSplit/>
+        </w:trPr>
+        <w:tc>
+          <w:tcPr>
+            <w:tcW w:w="4896" w:type="dxa"/>
+            <w:shd w:val="clear" w:color="auto" w:fill="auto"/>
+            <w:vAlign w:val="center"/>
+          </w:tcPr>
+          <w:p>
+            <w:pPr>
+              <w:keepNext w:val="0"/>
+            </w:pPr>
+            <w:r>
+              <w:rPr>
+                <w:rFonts w:ascii="Arial" w:hAnsi="Arial"/>
+                <w:i w:val="0"/>
+                <w:color w:val="000000"/>
+                <w:sz w:val="21"/>
+              </w:rPr>
+              <w:t>Search Books Using AI</w:t>
+            </w:r>
+          </w:p>
+        </w:tc>
+        <w:tc>
+          <w:tcPr>
+            <w:tcW w:w="2088" w:type="dxa"/>
+            <w:shd w:val="clear" w:color="auto" w:fill="auto"/>
+            <w:vAlign w:val="center"/>
+          </w:tcPr>
+          <w:p>
+            <w:pPr>
+              <w:keepNext w:val="0"/>
+            </w:pPr>
+            <w:r>
+              <w:rPr>
+                <w:rFonts w:ascii="Arial" w:hAnsi="Arial"/>
+                <w:i w:val="0"/>
+                <w:color w:val="000000"/>
+                <w:sz w:val="21"/>
+              </w:rPr>
+              <w:t>27-10-2026</w:t>
+            </w:r>
+          </w:p>
+        </w:tc>
+        <w:tc>
+          <w:tcPr>
+            <w:tcW w:w="2088" w:type="dxa"/>
+          </w:tcPr>
+          <w:p>
+            <w:pPr>
+              <w:keepNext w:val="0"/>
+            </w:pPr>
+            <w:r>
+              <w:rPr>
+                <w:rFonts w:ascii="Arial" w:hAnsi="Arial"/>
+                <w:i w:val="0"/>
+                <w:color w:val="000000"/>
+                <w:sz w:val="21"/>
+              </w:rPr>
+              <w:t>31-10-2026</w:t>
+            </w:r>
+          </w:p>
+        </w:tc>
+      </w:tr>
+      <w:tr>
+        <w:trPr>
+          <w:trHeight w:val="264"/>
+          <w:cantSplit/>
+        </w:trPr>
+        <w:tc>
+          <w:tcPr>
+            <w:tcW w:w="4896" w:type="dxa"/>
+            <w:shd w:val="clear" w:color="auto" w:fill="auto"/>
+            <w:vAlign w:val="center"/>
+          </w:tcPr>
+          <w:p>
+            <w:pPr>
+              <w:keepNext w:val="0"/>
+            </w:pPr>
+            <w:r>
+              <w:rPr>
+                <w:rFonts w:ascii="Arial" w:hAnsi="Arial"/>
+                <w:i w:val="0"/>
+                <w:color w:val="000000"/>
+                <w:sz w:val="21"/>
+              </w:rPr>
+              <w:t>Manage Personal Profile</w:t>
+            </w:r>
+          </w:p>
+        </w:tc>
+        <w:tc>
+          <w:tcPr>
+            <w:tcW w:w="2088" w:type="dxa"/>
+            <w:shd w:val="clear" w:color="auto" w:fill="auto"/>
+            <w:vAlign w:val="center"/>
+          </w:tcPr>
+          <w:p>
+            <w:pPr>
+              <w:keepNext w:val="0"/>
+            </w:pPr>
+            <w:r>
+              <w:rPr>
+                <w:rFonts w:ascii="Arial" w:hAnsi="Arial"/>
+                <w:i w:val="0"/>
+                <w:color w:val="000000"/>
+                <w:sz w:val="21"/>
+              </w:rPr>
+              <w:t>27-10-2026</w:t>
+            </w:r>
+          </w:p>
+        </w:tc>
+        <w:tc>
+          <w:tcPr>
+            <w:tcW w:w="2088" w:type="dxa"/>
+          </w:tcPr>
+          <w:p>
+            <w:pPr>
+              <w:keepNext w:val="0"/>
+            </w:pPr>
+            <w:r>
+              <w:rPr>
+                <w:rFonts w:ascii="Arial" w:hAnsi="Arial"/>
+                <w:i w:val="0"/>
+                <w:color w:val="000000"/>
+                <w:sz w:val="21"/>
+              </w:rPr>
+              <w:t>31-10-2026</w:t>
+            </w:r>
+          </w:p>
+        </w:tc>
+      </w:tr>
+      <w:tr>
+        <w:trPr>
+          <w:trHeight w:val="264"/>
+          <w:cantSplit/>
+        </w:trPr>
+        <w:tc>
+          <w:tcPr>
+            <w:tcW w:w="4896" w:type="dxa"/>
+            <w:shd w:val="clear" w:color="auto" w:fill="auto"/>
+            <w:vAlign w:val="center"/>
+          </w:tcPr>
+          <w:p>
+            <w:pPr>
+              <w:keepNext w:val="0"/>
+            </w:pPr>
+            <w:r>
+              <w:rPr>
+                <w:rFonts w:ascii="Arial" w:hAnsi="Arial"/>
+                <w:i w:val="0"/>
+                <w:color w:val="000000"/>
+                <w:sz w:val="21"/>
+              </w:rPr>
+              <w:t>Borrow Books Request</w:t>
+            </w:r>
+          </w:p>
+        </w:tc>
+        <w:tc>
+          <w:tcPr>
+            <w:tcW w:w="2088" w:type="dxa"/>
+            <w:shd w:val="clear" w:color="auto" w:fill="auto"/>
+            <w:vAlign w:val="center"/>
+          </w:tcPr>
+          <w:p>
+            <w:pPr>
+              <w:keepNext w:val="0"/>
+            </w:pPr>
+            <w:r>
+              <w:rPr>
+                <w:rFonts w:ascii="Arial" w:hAnsi="Arial"/>
+                <w:i w:val="0"/>
+                <w:color w:val="000000"/>
+                <w:sz w:val="21"/>
+              </w:rPr>
+              <w:t>27-10-2026</w:t>
+            </w:r>
+          </w:p>
+        </w:tc>
+        <w:tc>
+          <w:tcPr>
+            <w:tcW w:w="2088" w:type="dxa"/>
+          </w:tcPr>
+          <w:p>
+            <w:pPr>
+              <w:keepNext w:val="0"/>
+            </w:pPr>
+            <w:r>
+              <w:rPr>
+                <w:rFonts w:ascii="Arial" w:hAnsi="Arial"/>
+                <w:i w:val="0"/>
+                <w:color w:val="000000"/>
+                <w:sz w:val="21"/>
+              </w:rPr>
+              <w:t>31-10-2026</w:t>
+            </w:r>
+          </w:p>
+        </w:tc>
+      </w:tr>
+      <w:tr>
+        <w:trPr>
+          <w:trHeight w:val="264"/>
+          <w:cantSplit/>
+        </w:trPr>
+        <w:tc>
+          <w:tcPr>
+            <w:tcW w:w="4896" w:type="dxa"/>
+            <w:shd w:val="clear" w:color="auto" w:fill="auto"/>
+            <w:vAlign w:val="center"/>
+          </w:tcPr>
+          <w:p>
+            <w:pPr>
+              <w:keepNext w:val="0"/>
+            </w:pPr>
+            <w:r>
+              <w:rPr>
+                <w:rFonts w:ascii="Arial" w:hAnsi="Arial"/>
+                <w:i w:val="0"/>
+                <w:color w:val="000000"/>
+                <w:sz w:val="21"/>
+              </w:rPr>
+              <w:t>Book Renewals</w:t>
+            </w:r>
+          </w:p>
+        </w:tc>
+        <w:tc>
+          <w:tcPr>
+            <w:tcW w:w="2088" w:type="dxa"/>
+            <w:shd w:val="clear" w:color="auto" w:fill="auto"/>
+            <w:vAlign w:val="center"/>
+          </w:tcPr>
+          <w:p>
+            <w:pPr>
+              <w:keepNext w:val="0"/>
+            </w:pPr>
+            <w:r>
+              <w:rPr>
+                <w:rFonts w:ascii="Arial" w:hAnsi="Arial"/>
+                <w:i w:val="0"/>
+                <w:color w:val="000000"/>
+                <w:sz w:val="21"/>
+              </w:rPr>
+              <w:t>27-10-2026</w:t>
+            </w:r>
+          </w:p>
+        </w:tc>
+        <w:tc>
+          <w:tcPr>
+            <w:tcW w:w="2088" w:type="dxa"/>
+          </w:tcPr>
+          <w:p>
+            <w:pPr>
+              <w:keepNext w:val="0"/>
+            </w:pPr>
+            <w:r>
+              <w:rPr>
+                <w:rFonts w:ascii="Arial" w:hAnsi="Arial"/>
+                <w:i w:val="0"/>
+                <w:color w:val="000000"/>
+                <w:sz w:val="21"/>
+              </w:rPr>
+              <w:t>31-10-2026</w:t>
+            </w:r>
+          </w:p>
+        </w:tc>
+      </w:tr>
+      <w:tr>
+        <w:trPr>
+          <w:trHeight w:val="264"/>
+          <w:cantSplit/>
+        </w:trPr>
+        <w:tc>
+          <w:tcPr>
+            <w:tcW w:w="4896" w:type="dxa"/>
+            <w:shd w:val="clear" w:color="auto" w:fill="auto"/>
+            <w:vAlign w:val="center"/>
+          </w:tcPr>
+          <w:p>
+            <w:pPr>
+              <w:keepNext w:val="0"/>
+            </w:pPr>
+            <w:r>
+              <w:rPr>
+                <w:rFonts w:ascii="Arial" w:hAnsi="Arial"/>
+                <w:i w:val="0"/>
+                <w:color w:val="000000"/>
+                <w:sz w:val="21"/>
+              </w:rPr>
+              <w:t>Reserve Books</w:t>
+            </w:r>
+          </w:p>
+        </w:tc>
+        <w:tc>
+          <w:tcPr>
+            <w:tcW w:w="2088" w:type="dxa"/>
+            <w:shd w:val="clear" w:color="auto" w:fill="auto"/>
+            <w:vAlign w:val="center"/>
+          </w:tcPr>
+          <w:p>
+            <w:pPr>
+              <w:keepNext w:val="0"/>
+            </w:pPr>
+            <w:r>
+              <w:rPr>
+                <w:rFonts w:ascii="Arial" w:hAnsi="Arial"/>
+                <w:i w:val="0"/>
+                <w:color w:val="000000"/>
+                <w:sz w:val="21"/>
+              </w:rPr>
+              <w:t>27-10-2026</w:t>
+            </w:r>
+          </w:p>
+        </w:tc>
+        <w:tc>
+          <w:tcPr>
+            <w:tcW w:w="2088" w:type="dxa"/>
+          </w:tcPr>
+          <w:p>
+            <w:pPr>
+              <w:keepNext w:val="0"/>
+            </w:pPr>
+            <w:r>
+              <w:rPr>
+                <w:rFonts w:ascii="Arial" w:hAnsi="Arial"/>
+                <w:i w:val="0"/>
+                <w:color w:val="000000"/>
+                <w:sz w:val="21"/>
+              </w:rPr>
+              <w:t>31-10-2026</w:t>
+            </w:r>
+          </w:p>
+        </w:tc>
+      </w:tr>
+      <w:tr>
+        <w:trPr>
+          <w:trHeight w:val="264"/>
+          <w:cantSplit/>
+        </w:trPr>
+        <w:tc>
+          <w:tcPr>
+            <w:tcW w:w="4896" w:type="dxa"/>
+            <w:shd w:val="clear" w:color="auto" w:fill="auto"/>
+            <w:vAlign w:val="center"/>
+          </w:tcPr>
+          <w:p>
+            <w:pPr>
+              <w:keepNext w:val="0"/>
+            </w:pPr>
+            <w:r>
+              <w:rPr>
+                <w:rFonts w:ascii="Arial" w:hAnsi="Arial"/>
+                <w:i w:val="0"/>
+                <w:color w:val="000000"/>
+                <w:sz w:val="21"/>
+              </w:rPr>
+              <w:t>View Book Reviews &amp; Ratings</w:t>
+            </w:r>
+          </w:p>
+        </w:tc>
+        <w:tc>
+          <w:tcPr>
+            <w:tcW w:w="2088" w:type="dxa"/>
+            <w:shd w:val="clear" w:color="auto" w:fill="auto"/>
+            <w:vAlign w:val="center"/>
+          </w:tcPr>
+          <w:p>
+            <w:pPr>
+              <w:keepNext w:val="0"/>
+            </w:pPr>
+            <w:r>
+              <w:rPr>
+                <w:rFonts w:ascii="Arial" w:hAnsi="Arial"/>
+                <w:i w:val="0"/>
+                <w:color w:val="000000"/>
+                <w:sz w:val="21"/>
+              </w:rPr>
+              <w:t>27-10-2026</w:t>
+            </w:r>
+          </w:p>
+        </w:tc>
+        <w:tc>
+          <w:tcPr>
+            <w:tcW w:w="2088" w:type="dxa"/>
+          </w:tcPr>
+          <w:p>
+            <w:pPr>
+              <w:keepNext w:val="0"/>
+            </w:pPr>
+            <w:r>
+              <w:rPr>
+                <w:rFonts w:ascii="Arial" w:hAnsi="Arial"/>
+                <w:i w:val="0"/>
+                <w:color w:val="000000"/>
+                <w:sz w:val="21"/>
+              </w:rPr>
+              <w:t>31-10-2026</w:t>
+            </w:r>
+          </w:p>
+        </w:tc>
+      </w:tr>
+      <w:tr>
+        <w:trPr>
+          <w:trHeight w:val="264"/>
+          <w:cantSplit/>
+        </w:trPr>
+        <w:tc>
+          <w:tcPr>
+            <w:tcW w:w="4896" w:type="dxa"/>
+            <w:shd w:val="clear" w:color="auto" w:fill="auto"/>
+            <w:vAlign w:val="center"/>
+          </w:tcPr>
+          <w:p>
+            <w:pPr>
+              <w:keepNext w:val="0"/>
+            </w:pPr>
+            <w:r>
+              <w:rPr>
+                <w:rFonts w:ascii="Arial" w:hAnsi="Arial"/>
+                <w:i w:val="0"/>
+                <w:color w:val="000000"/>
+                <w:sz w:val="21"/>
+              </w:rPr>
+              <w:t>Reviews &amp; Ratings</w:t>
+            </w:r>
+          </w:p>
+        </w:tc>
+        <w:tc>
+          <w:tcPr>
+            <w:tcW w:w="2088" w:type="dxa"/>
+            <w:shd w:val="clear" w:color="auto" w:fill="auto"/>
+            <w:vAlign w:val="center"/>
+          </w:tcPr>
+          <w:p>
+            <w:pPr>
+              <w:keepNext w:val="0"/>
+            </w:pPr>
+            <w:r>
+              <w:rPr>
+                <w:rFonts w:ascii="Arial" w:hAnsi="Arial"/>
+                <w:i w:val="0"/>
+                <w:color w:val="000000"/>
+                <w:sz w:val="21"/>
+              </w:rPr>
+              <w:t>27-10-2026</w:t>
+            </w:r>
+          </w:p>
+        </w:tc>
+        <w:tc>
+          <w:tcPr>
+            <w:tcW w:w="2088" w:type="dxa"/>
+          </w:tcPr>
+          <w:p>
+            <w:pPr>
+              <w:keepNext w:val="0"/>
+            </w:pPr>
+            <w:r>
+              <w:rPr>
+                <w:rFonts w:ascii="Arial" w:hAnsi="Arial"/>
+                <w:i w:val="0"/>
+                <w:color w:val="000000"/>
+                <w:sz w:val="21"/>
+              </w:rPr>
+              <w:t>31-10-2026</w:t>
+            </w:r>
+          </w:p>
+        </w:tc>
+      </w:tr>
+      <w:tr>
+        <w:trPr>
+          <w:trHeight w:val="264"/>
+          <w:cantSplit/>
+        </w:trPr>
+        <w:tc>
+          <w:tcPr>
+            <w:tcW w:w="4896" w:type="dxa"/>
+            <w:shd w:val="clear" w:color="auto" w:fill="auto"/>
+            <w:vAlign w:val="center"/>
+          </w:tcPr>
+          <w:p>
+            <w:pPr>
+              <w:keepNext w:val="0"/>
+            </w:pPr>
+            <w:r>
+              <w:rPr>
+                <w:rFonts w:ascii="Arial" w:hAnsi="Arial"/>
+                <w:i w:val="0"/>
+                <w:color w:val="000000"/>
+                <w:sz w:val="21"/>
+              </w:rPr>
+              <w:t>Complaints &amp; Feedback</w:t>
+            </w:r>
+          </w:p>
+        </w:tc>
+        <w:tc>
+          <w:tcPr>
+            <w:tcW w:w="2088" w:type="dxa"/>
+            <w:shd w:val="clear" w:color="auto" w:fill="auto"/>
+            <w:vAlign w:val="center"/>
+          </w:tcPr>
+          <w:p>
+            <w:pPr>
+              <w:keepNext w:val="0"/>
+            </w:pPr>
+            <w:r>
+              <w:rPr>
+                <w:rFonts w:ascii="Arial" w:hAnsi="Arial"/>
+                <w:i w:val="0"/>
+                <w:color w:val="000000"/>
+                <w:sz w:val="21"/>
+              </w:rPr>
+              <w:t>27-10-2026</w:t>
+            </w:r>
+          </w:p>
+        </w:tc>
+        <w:tc>
+          <w:tcPr>
+            <w:tcW w:w="2088" w:type="dxa"/>
+          </w:tcPr>
+          <w:p>
+            <w:pPr>
+              <w:keepNext w:val="0"/>
+            </w:pPr>
+            <w:r>
+              <w:rPr>
+                <w:rFonts w:ascii="Arial" w:hAnsi="Arial"/>
+                <w:i w:val="0"/>
+                <w:color w:val="000000"/>
+                <w:sz w:val="21"/>
+              </w:rPr>
+              <w:t>31-10-2026</w:t>
+            </w:r>
+          </w:p>
+        </w:tc>
+      </w:tr>
+      <w:tr>
+        <w:trPr>
+          <w:trHeight w:val="264"/>
+          <w:cantSplit/>
+        </w:trPr>
+        <w:tc>
+          <w:tcPr>
+            <w:tcW w:w="4896" w:type="dxa"/>
+            <w:shd w:val="clear" w:color="auto" w:fill="auto"/>
+            <w:vAlign w:val="center"/>
+          </w:tcPr>
+          <w:p>
+            <w:pPr>
+              <w:keepNext w:val="0"/>
+            </w:pPr>
+            <w:r>
+              <w:rPr>
+                <w:rFonts w:ascii="Arial" w:hAnsi="Arial"/>
+                <w:i w:val="0"/>
+                <w:color w:val="000000"/>
+                <w:sz w:val="21"/>
+              </w:rPr>
+              <w:t>View History Complaints</w:t>
+            </w:r>
+          </w:p>
+        </w:tc>
+        <w:tc>
+          <w:tcPr>
+            <w:tcW w:w="2088" w:type="dxa"/>
+            <w:shd w:val="clear" w:color="auto" w:fill="auto"/>
+            <w:vAlign w:val="center"/>
+          </w:tcPr>
+          <w:p>
+            <w:pPr>
+              <w:keepNext w:val="0"/>
+            </w:pPr>
+            <w:r>
+              <w:rPr>
+                <w:rFonts w:ascii="Arial" w:hAnsi="Arial"/>
+                <w:i w:val="0"/>
+                <w:color w:val="000000"/>
+                <w:sz w:val="21"/>
+              </w:rPr>
+              <w:t>27-10-2026</w:t>
+            </w:r>
+          </w:p>
+        </w:tc>
+        <w:tc>
+          <w:tcPr>
+            <w:tcW w:w="2088" w:type="dxa"/>
+          </w:tcPr>
+          <w:p>
+            <w:pPr>
+              <w:keepNext w:val="0"/>
+            </w:pPr>
+            <w:r>
+              <w:rPr>
+                <w:rFonts w:ascii="Arial" w:hAnsi="Arial"/>
+                <w:i w:val="0"/>
+                <w:color w:val="000000"/>
+                <w:sz w:val="21"/>
+              </w:rPr>
+              <w:t>31-10-2026</w:t>
+            </w:r>
+          </w:p>
+        </w:tc>
+      </w:tr>
+      <w:tr>
+        <w:trPr>
+          <w:trHeight w:val="264"/>
+          <w:cantSplit/>
+        </w:trPr>
+        <w:tc>
+          <w:tcPr>
+            <w:tcW w:w="4896" w:type="dxa"/>
+            <w:shd w:val="clear" w:color="auto" w:fill="auto"/>
+            <w:vAlign w:val="center"/>
+          </w:tcPr>
+          <w:p>
+            <w:pPr>
+              <w:keepNext w:val="0"/>
+            </w:pPr>
+            <w:r>
+              <w:rPr>
+                <w:rFonts w:ascii="Arial" w:hAnsi="Arial"/>
+                <w:i w:val="0"/>
+                <w:color w:val="000000"/>
+                <w:sz w:val="21"/>
+              </w:rPr>
+              <w:t>Submit Library Support Request</w:t>
+            </w:r>
+          </w:p>
+        </w:tc>
+        <w:tc>
+          <w:tcPr>
+            <w:tcW w:w="2088" w:type="dxa"/>
+            <w:shd w:val="clear" w:color="auto" w:fill="auto"/>
+            <w:vAlign w:val="center"/>
+          </w:tcPr>
+          <w:p>
+            <w:pPr>
+              <w:keepNext w:val="0"/>
+            </w:pPr>
+            <w:r>
+              <w:rPr>
+                <w:rFonts w:ascii="Arial" w:hAnsi="Arial"/>
+                <w:i w:val="0"/>
+                <w:color w:val="000000"/>
+                <w:sz w:val="21"/>
+              </w:rPr>
+              <w:t>27-10-2026</w:t>
+            </w:r>
+          </w:p>
+        </w:tc>
+        <w:tc>
+          <w:tcPr>
+            <w:tcW w:w="2088" w:type="dxa"/>
+          </w:tcPr>
+          <w:p>
+            <w:pPr>
+              <w:keepNext w:val="0"/>
+            </w:pPr>
+            <w:r>
+              <w:rPr>
+                <w:rFonts w:ascii="Arial" w:hAnsi="Arial"/>
+                <w:i w:val="0"/>
+                <w:color w:val="000000"/>
+                <w:sz w:val="21"/>
+              </w:rPr>
+              <w:t>31-10-2026</w:t>
+            </w:r>
+          </w:p>
+        </w:tc>
+      </w:tr>
+      <w:tr>
+        <w:trPr>
+          <w:trHeight w:val="264"/>
+          <w:cantSplit/>
+        </w:trPr>
+        <w:tc>
+          <w:tcPr>
+            <w:tcW w:w="4896" w:type="dxa"/>
+            <w:shd w:val="clear" w:color="auto" w:fill="auto"/>
+            <w:vAlign w:val="center"/>
+          </w:tcPr>
+          <w:p>
+            <w:pPr>
+              <w:keepNext w:val="0"/>
+            </w:pPr>
+            <w:r>
+              <w:rPr>
+                <w:rFonts w:ascii="Arial" w:hAnsi="Arial"/>
+                <w:i w:val="0"/>
+                <w:color w:val="000000"/>
+                <w:sz w:val="21"/>
+              </w:rPr>
+              <w:t>View Fines</w:t>
+            </w:r>
+          </w:p>
+        </w:tc>
+        <w:tc>
+          <w:tcPr>
+            <w:tcW w:w="2088" w:type="dxa"/>
+            <w:shd w:val="clear" w:color="auto" w:fill="auto"/>
+            <w:vAlign w:val="center"/>
+          </w:tcPr>
+          <w:p>
+            <w:pPr>
+              <w:keepNext w:val="0"/>
+            </w:pPr>
+            <w:r>
+              <w:rPr>
+                <w:rFonts w:ascii="Arial" w:hAnsi="Arial"/>
+                <w:i w:val="0"/>
+                <w:color w:val="000000"/>
+                <w:sz w:val="21"/>
+              </w:rPr>
+              <w:t>27-10-2026</w:t>
+            </w:r>
+          </w:p>
+        </w:tc>
+        <w:tc>
+          <w:tcPr>
+            <w:tcW w:w="2088" w:type="dxa"/>
+          </w:tcPr>
+          <w:p>
+            <w:pPr>
+              <w:keepNext w:val="0"/>
+            </w:pPr>
+            <w:r>
+              <w:rPr>
+                <w:rFonts w:ascii="Arial" w:hAnsi="Arial"/>
+                <w:i w:val="0"/>
+                <w:color w:val="000000"/>
+                <w:sz w:val="21"/>
+              </w:rPr>
+              <w:t>31-10-2026</w:t>
+            </w:r>
+          </w:p>
+        </w:tc>
+      </w:tr>
+      <w:tr>
+        <w:trPr>
+          <w:trHeight w:val="264"/>
+          <w:cantSplit/>
+        </w:trPr>
+        <w:tc>
+          <w:tcPr>
+            <w:tcW w:w="4896" w:type="dxa"/>
+            <w:shd w:val="clear" w:color="auto" w:fill="auto"/>
+            <w:vAlign w:val="center"/>
+          </w:tcPr>
+          <w:p>
+            <w:pPr>
+              <w:keepNext w:val="0"/>
+            </w:pPr>
+            <w:r>
+              <w:rPr>
+                <w:rFonts w:ascii="Arial" w:hAnsi="Arial"/>
+                <w:i w:val="0"/>
+                <w:color w:val="000000"/>
+                <w:sz w:val="21"/>
+              </w:rPr>
+              <w:t>View Notifications / View Library News</w:t>
+            </w:r>
+          </w:p>
+        </w:tc>
+        <w:tc>
+          <w:tcPr>
+            <w:tcW w:w="2088" w:type="dxa"/>
+            <w:shd w:val="clear" w:color="auto" w:fill="auto"/>
+            <w:vAlign w:val="center"/>
+          </w:tcPr>
+          <w:p>
+            <w:pPr>
+              <w:keepNext w:val="0"/>
+            </w:pPr>
+            <w:r>
+              <w:rPr>
+                <w:rFonts w:ascii="Arial" w:hAnsi="Arial"/>
+                <w:i w:val="0"/>
+                <w:color w:val="000000"/>
+                <w:sz w:val="21"/>
+              </w:rPr>
+              <w:t>27-10-2026</w:t>
+            </w:r>
+          </w:p>
+        </w:tc>
+        <w:tc>
+          <w:tcPr>
+            <w:tcW w:w="2088" w:type="dxa"/>
+          </w:tcPr>
+          <w:p>
+            <w:pPr>
+              <w:keepNext w:val="0"/>
+            </w:pPr>
+            <w:r>
+              <w:rPr>
+                <w:rFonts w:ascii="Arial" w:hAnsi="Arial"/>
+                <w:i w:val="0"/>
+                <w:color w:val="000000"/>
+                <w:sz w:val="21"/>
+              </w:rPr>
+              <w:t>31-10-2026</w:t>
+            </w:r>
+          </w:p>
+        </w:tc>
+      </w:tr>
+      <w:tr>
+        <w:trPr>
+          <w:trHeight w:val="264"/>
+          <w:cantSplit/>
+        </w:trPr>
+        <w:tc>
+          <w:tcPr>
+            <w:tcW w:w="4896" w:type="dxa"/>
+            <w:shd w:val="clear" w:color="auto" w:fill="auto"/>
+            <w:vAlign w:val="center"/>
+          </w:tcPr>
+          <w:p>
+            <w:pPr>
+              <w:keepNext w:val="0"/>
+            </w:pPr>
+            <w:r>
+              <w:rPr>
+                <w:rFonts w:ascii="Arial" w:hAnsi="Arial"/>
+                <w:i w:val="0"/>
+                <w:color w:val="000000"/>
+                <w:sz w:val="21"/>
+              </w:rPr>
+              <w:t>Approve External Reader Registration</w:t>
+            </w:r>
+          </w:p>
+        </w:tc>
+        <w:tc>
+          <w:tcPr>
+            <w:tcW w:w="2088" w:type="dxa"/>
+            <w:shd w:val="clear" w:color="auto" w:fill="auto"/>
+            <w:vAlign w:val="center"/>
+          </w:tcPr>
+          <w:p>
+            <w:pPr>
+              <w:keepNext w:val="0"/>
+            </w:pPr>
+            <w:r>
+              <w:rPr>
+                <w:rFonts w:ascii="Arial" w:hAnsi="Arial"/>
+                <w:i w:val="0"/>
+                <w:color w:val="000000"/>
+                <w:sz w:val="21"/>
+              </w:rPr>
+              <w:t>27-10-2026</w:t>
+            </w:r>
+          </w:p>
+        </w:tc>
+        <w:tc>
+          <w:tcPr>
+            <w:tcW w:w="2088" w:type="dxa"/>
+          </w:tcPr>
+          <w:p>
+            <w:pPr>
+              <w:keepNext w:val="0"/>
+            </w:pPr>
+            <w:r>
+              <w:rPr>
+                <w:rFonts w:ascii="Arial" w:hAnsi="Arial"/>
+                <w:i w:val="0"/>
+                <w:color w:val="000000"/>
+                <w:sz w:val="21"/>
+              </w:rPr>
+              <w:t>31-10-2026</w:t>
+            </w:r>
+          </w:p>
+        </w:tc>
+      </w:tr>
+      <w:tr>
+        <w:trPr>
+          <w:trHeight w:val="264"/>
+          <w:cantSplit/>
+        </w:trPr>
+        <w:tc>
+          <w:tcPr>
+            <w:tcW w:w="4896" w:type="dxa"/>
+            <w:shd w:val="clear" w:color="auto" w:fill="auto"/>
+            <w:vAlign w:val="center"/>
+          </w:tcPr>
+          <w:p>
+            <w:pPr>
+              <w:keepNext w:val="0"/>
+            </w:pPr>
+            <w:r>
+              <w:rPr>
+                <w:rFonts w:ascii="Arial" w:hAnsi="Arial"/>
+                <w:i w:val="0"/>
+                <w:color w:val="000000"/>
+                <w:sz w:val="21"/>
+              </w:rPr>
+              <w:t>View Reader Information</w:t>
+            </w:r>
+          </w:p>
+        </w:tc>
+        <w:tc>
+          <w:tcPr>
+            <w:tcW w:w="2088" w:type="dxa"/>
+            <w:shd w:val="clear" w:color="auto" w:fill="auto"/>
+            <w:vAlign w:val="center"/>
+          </w:tcPr>
+          <w:p>
+            <w:pPr>
+              <w:keepNext w:val="0"/>
+            </w:pPr>
+            <w:r>
+              <w:rPr>
+                <w:rFonts w:ascii="Arial" w:hAnsi="Arial"/>
+                <w:i w:val="0"/>
+                <w:color w:val="000000"/>
+                <w:sz w:val="21"/>
+              </w:rPr>
+              <w:t>27-10-2026</w:t>
+            </w:r>
+          </w:p>
+        </w:tc>
+        <w:tc>
+          <w:tcPr>
+            <w:tcW w:w="2088" w:type="dxa"/>
+          </w:tcPr>
+          <w:p>
+            <w:pPr>
+              <w:keepNext w:val="0"/>
+            </w:pPr>
+            <w:r>
+              <w:rPr>
+                <w:rFonts w:ascii="Arial" w:hAnsi="Arial"/>
+                <w:i w:val="0"/>
+                <w:color w:val="000000"/>
+                <w:sz w:val="21"/>
+              </w:rPr>
+              <w:t>31-10-2026</w:t>
+            </w:r>
+          </w:p>
+        </w:tc>
+      </w:tr>
+      <w:tr>
+        <w:trPr>
+          <w:trHeight w:val="264"/>
+          <w:cantSplit/>
+        </w:trPr>
+        <w:tc>
+          <w:tcPr>
+            <w:tcW w:w="4896" w:type="dxa"/>
+            <w:shd w:val="clear" w:color="auto" w:fill="auto"/>
+            <w:vAlign w:val="center"/>
+          </w:tcPr>
+          <w:p>
+            <w:pPr>
+              <w:keepNext w:val="0"/>
+            </w:pPr>
+            <w:r>
+              <w:rPr>
+                <w:rFonts w:ascii="Arial" w:hAnsi="Arial"/>
+                <w:i w:val="0"/>
+                <w:color w:val="000000"/>
+                <w:sz w:val="21"/>
+              </w:rPr>
+              <w:t>Manage Personal Profile</w:t>
+            </w:r>
+          </w:p>
+        </w:tc>
+        <w:tc>
+          <w:tcPr>
+            <w:tcW w:w="2088" w:type="dxa"/>
+            <w:shd w:val="clear" w:color="auto" w:fill="auto"/>
+            <w:vAlign w:val="center"/>
+          </w:tcPr>
+          <w:p>
+            <w:pPr>
+              <w:keepNext w:val="0"/>
+            </w:pPr>
+            <w:r>
+              <w:rPr>
+                <w:rFonts w:ascii="Arial" w:hAnsi="Arial"/>
+                <w:i w:val="0"/>
+                <w:color w:val="000000"/>
+                <w:sz w:val="21"/>
+              </w:rPr>
+              <w:t>27-10-2026</w:t>
+            </w:r>
+          </w:p>
+        </w:tc>
+        <w:tc>
+          <w:tcPr>
+            <w:tcW w:w="2088" w:type="dxa"/>
+          </w:tcPr>
+          <w:p>
+            <w:pPr>
+              <w:keepNext w:val="0"/>
+            </w:pPr>
+            <w:r>
+              <w:rPr>
+                <w:rFonts w:ascii="Arial" w:hAnsi="Arial"/>
+                <w:i w:val="0"/>
+                <w:color w:val="000000"/>
+                <w:sz w:val="21"/>
+              </w:rPr>
+              <w:t>31-10-2026</w:t>
+            </w:r>
+          </w:p>
+        </w:tc>
+      </w:tr>
+      <w:tr>
+        <w:trPr>
+          <w:trHeight w:val="264"/>
+          <w:cantSplit/>
+        </w:trPr>
+        <w:tc>
+          <w:tcPr>
+            <w:tcW w:w="4896" w:type="dxa"/>
+            <w:shd w:val="clear" w:color="auto" w:fill="auto"/>
+            <w:vAlign w:val="center"/>
+          </w:tcPr>
+          <w:p>
+            <w:pPr>
+              <w:keepNext w:val="0"/>
+            </w:pPr>
+            <w:r>
+              <w:rPr>
+                <w:rFonts w:ascii="Arial" w:hAnsi="Arial"/>
+                <w:i w:val="0"/>
+                <w:color w:val="000000"/>
+                <w:sz w:val="21"/>
+              </w:rPr>
+              <w:t>Manage News</w:t>
+            </w:r>
+          </w:p>
+        </w:tc>
+        <w:tc>
+          <w:tcPr>
+            <w:tcW w:w="2088" w:type="dxa"/>
+            <w:shd w:val="clear" w:color="auto" w:fill="auto"/>
+            <w:vAlign w:val="center"/>
+          </w:tcPr>
+          <w:p>
+            <w:pPr>
+              <w:keepNext w:val="0"/>
+            </w:pPr>
+            <w:r>
+              <w:rPr>
+                <w:rFonts w:ascii="Arial" w:hAnsi="Arial"/>
+                <w:i w:val="0"/>
+                <w:color w:val="000000"/>
+                <w:sz w:val="21"/>
+              </w:rPr>
+              <w:t>27-10-2026</w:t>
+            </w:r>
+          </w:p>
+        </w:tc>
+        <w:tc>
+          <w:tcPr>
+            <w:tcW w:w="2088" w:type="dxa"/>
+          </w:tcPr>
+          <w:p>
+            <w:pPr>
+              <w:keepNext w:val="0"/>
+            </w:pPr>
+            <w:r>
+              <w:rPr>
+                <w:rFonts w:ascii="Arial" w:hAnsi="Arial"/>
+                <w:i w:val="0"/>
+                <w:color w:val="000000"/>
+                <w:sz w:val="21"/>
+              </w:rPr>
+              <w:t>31-10-2026</w:t>
+            </w:r>
+          </w:p>
+        </w:tc>
+      </w:tr>
+      <w:tr>
+        <w:trPr>
+          <w:trHeight w:val="264"/>
+          <w:cantSplit/>
+        </w:trPr>
+        <w:tc>
+          <w:tcPr>
+            <w:tcW w:w="4896" w:type="dxa"/>
+            <w:shd w:val="clear" w:color="auto" w:fill="auto"/>
+            <w:vAlign w:val="center"/>
+          </w:tcPr>
+          <w:p>
+            <w:pPr>
+              <w:keepNext w:val="0"/>
+            </w:pPr>
+            <w:r>
+              <w:rPr>
+                <w:rFonts w:ascii="Arial" w:hAnsi="Arial"/>
+                <w:i w:val="0"/>
+                <w:color w:val="000000"/>
+                <w:sz w:val="21"/>
+              </w:rPr>
+              <w:t>View Borrowing Request</w:t>
+            </w:r>
+          </w:p>
+        </w:tc>
+        <w:tc>
+          <w:tcPr>
+            <w:tcW w:w="2088" w:type="dxa"/>
+            <w:shd w:val="clear" w:color="auto" w:fill="auto"/>
+            <w:vAlign w:val="center"/>
+          </w:tcPr>
+          <w:p>
+            <w:pPr>
+              <w:keepNext w:val="0"/>
+            </w:pPr>
+            <w:r>
+              <w:rPr>
+                <w:rFonts w:ascii="Arial" w:hAnsi="Arial"/>
+                <w:i w:val="0"/>
+                <w:color w:val="000000"/>
+                <w:sz w:val="21"/>
+              </w:rPr>
+              <w:t>27-10-2026</w:t>
+            </w:r>
+          </w:p>
+        </w:tc>
+        <w:tc>
+          <w:tcPr>
+            <w:tcW w:w="2088" w:type="dxa"/>
+          </w:tcPr>
+          <w:p>
+            <w:pPr>
+              <w:keepNext w:val="0"/>
+            </w:pPr>
+            <w:r>
+              <w:rPr>
+                <w:rFonts w:ascii="Arial" w:hAnsi="Arial"/>
+                <w:i w:val="0"/>
+                <w:color w:val="000000"/>
+                <w:sz w:val="21"/>
+              </w:rPr>
+              <w:t>31-10-2026</w:t>
+            </w:r>
+          </w:p>
+        </w:tc>
+      </w:tr>
+      <w:tr>
+        <w:trPr>
+          <w:trHeight w:val="264"/>
+          <w:cantSplit/>
+        </w:trPr>
+        <w:tc>
+          <w:tcPr>
+            <w:tcW w:w="4896" w:type="dxa"/>
+            <w:shd w:val="clear" w:color="auto" w:fill="auto"/>
+            <w:vAlign w:val="center"/>
+          </w:tcPr>
+          <w:p>
+            <w:pPr>
+              <w:keepNext w:val="0"/>
+            </w:pPr>
+            <w:r>
+              <w:rPr>
+                <w:rFonts w:ascii="Arial" w:hAnsi="Arial"/>
+                <w:i w:val="0"/>
+                <w:color w:val="000000"/>
+                <w:sz w:val="21"/>
+              </w:rPr>
+              <w:t>Create Borrowing Ticket</w:t>
+            </w:r>
+          </w:p>
+        </w:tc>
+        <w:tc>
+          <w:tcPr>
+            <w:tcW w:w="2088" w:type="dxa"/>
+            <w:shd w:val="clear" w:color="auto" w:fill="auto"/>
+            <w:vAlign w:val="center"/>
+          </w:tcPr>
+          <w:p>
+            <w:pPr>
+              <w:keepNext w:val="0"/>
+            </w:pPr>
+            <w:r>
+              <w:rPr>
+                <w:rFonts w:ascii="Arial" w:hAnsi="Arial"/>
+                <w:i w:val="0"/>
+                <w:color w:val="000000"/>
+                <w:sz w:val="21"/>
+              </w:rPr>
+              <w:t>27-10-2026</w:t>
+            </w:r>
+          </w:p>
+        </w:tc>
+        <w:tc>
+          <w:tcPr>
+            <w:tcW w:w="2088" w:type="dxa"/>
+          </w:tcPr>
+          <w:p>
+            <w:pPr>
+              <w:keepNext w:val="0"/>
+            </w:pPr>
+            <w:r>
+              <w:rPr>
+                <w:rFonts w:ascii="Arial" w:hAnsi="Arial"/>
+                <w:i w:val="0"/>
+                <w:color w:val="000000"/>
+                <w:sz w:val="21"/>
+              </w:rPr>
+              <w:t>31-10-2026</w:t>
+            </w:r>
+          </w:p>
+        </w:tc>
+      </w:tr>
+      <w:tr>
+        <w:trPr>
+          <w:trHeight w:val="264"/>
+          <w:cantSplit/>
+        </w:trPr>
+        <w:tc>
+          <w:tcPr>
+            <w:tcW w:w="4896" w:type="dxa"/>
+            <w:shd w:val="clear" w:color="auto" w:fill="auto"/>
+            <w:vAlign w:val="center"/>
+          </w:tcPr>
+          <w:p>
+            <w:pPr>
+              <w:keepNext w:val="0"/>
+            </w:pPr>
+            <w:r>
+              <w:rPr>
+                <w:rFonts w:ascii="Arial" w:hAnsi="Arial"/>
+                <w:i w:val="0"/>
+                <w:color w:val="000000"/>
+                <w:sz w:val="21"/>
+              </w:rPr>
+              <w:t>Returning &amp; Renewal</w:t>
+            </w:r>
+          </w:p>
+        </w:tc>
+        <w:tc>
+          <w:tcPr>
+            <w:tcW w:w="2088" w:type="dxa"/>
+            <w:shd w:val="clear" w:color="auto" w:fill="auto"/>
+            <w:vAlign w:val="center"/>
+          </w:tcPr>
+          <w:p>
+            <w:pPr>
+              <w:keepNext w:val="0"/>
+            </w:pPr>
+            <w:r>
+              <w:rPr>
+                <w:rFonts w:ascii="Arial" w:hAnsi="Arial"/>
+                <w:i w:val="0"/>
+                <w:color w:val="000000"/>
+                <w:sz w:val="21"/>
+              </w:rPr>
+              <w:t>27-10-2026</w:t>
+            </w:r>
+          </w:p>
+        </w:tc>
+        <w:tc>
+          <w:tcPr>
+            <w:tcW w:w="2088" w:type="dxa"/>
+          </w:tcPr>
+          <w:p>
+            <w:pPr>
+              <w:keepNext w:val="0"/>
+            </w:pPr>
+            <w:r>
+              <w:rPr>
+                <w:rFonts w:ascii="Arial" w:hAnsi="Arial"/>
+                <w:i w:val="0"/>
+                <w:color w:val="000000"/>
+                <w:sz w:val="21"/>
+              </w:rPr>
+              <w:t>31-10-2026</w:t>
+            </w:r>
+          </w:p>
+        </w:tc>
+      </w:tr>
+      <w:tr>
+        <w:trPr>
+          <w:trHeight w:val="264"/>
+          <w:cantSplit/>
+        </w:trPr>
+        <w:tc>
+          <w:tcPr>
+            <w:tcW w:w="4896" w:type="dxa"/>
+            <w:shd w:val="clear" w:color="auto" w:fill="auto"/>
+            <w:vAlign w:val="center"/>
+          </w:tcPr>
+          <w:p>
+            <w:pPr>
+              <w:keepNext w:val="0"/>
+            </w:pPr>
+            <w:r>
+              <w:rPr>
+                <w:rFonts w:ascii="Arial" w:hAnsi="Arial"/>
+                <w:i w:val="0"/>
+                <w:color w:val="000000"/>
+                <w:sz w:val="21"/>
+              </w:rPr>
+              <w:t>Book Reservation</w:t>
+            </w:r>
+          </w:p>
+        </w:tc>
+        <w:tc>
+          <w:tcPr>
+            <w:tcW w:w="2088" w:type="dxa"/>
+            <w:shd w:val="clear" w:color="auto" w:fill="auto"/>
+            <w:vAlign w:val="center"/>
+          </w:tcPr>
+          <w:p>
+            <w:pPr>
+              <w:keepNext w:val="0"/>
+            </w:pPr>
+            <w:r>
+              <w:rPr>
+                <w:rFonts w:ascii="Arial" w:hAnsi="Arial"/>
+                <w:i w:val="0"/>
+                <w:color w:val="000000"/>
+                <w:sz w:val="21"/>
+              </w:rPr>
+              <w:t>27-10-2026</w:t>
+            </w:r>
+          </w:p>
+        </w:tc>
+        <w:tc>
+          <w:tcPr>
+            <w:tcW w:w="2088" w:type="dxa"/>
+          </w:tcPr>
+          <w:p>
+            <w:pPr>
+              <w:keepNext w:val="0"/>
+            </w:pPr>
+            <w:r>
+              <w:rPr>
+                <w:rFonts w:ascii="Arial" w:hAnsi="Arial"/>
+                <w:i w:val="0"/>
+                <w:color w:val="000000"/>
+                <w:sz w:val="21"/>
+              </w:rPr>
+              <w:t>31-10-2026</w:t>
+            </w:r>
+          </w:p>
+        </w:tc>
+      </w:tr>
+      <w:tr>
+        <w:trPr>
+          <w:trHeight w:val="264"/>
+          <w:cantSplit/>
+        </w:trPr>
+        <w:tc>
+          <w:tcPr>
+            <w:tcW w:w="4896" w:type="dxa"/>
+            <w:shd w:val="clear" w:color="auto" w:fill="auto"/>
+            <w:vAlign w:val="center"/>
+          </w:tcPr>
+          <w:p>
+            <w:pPr>
+              <w:keepNext w:val="0"/>
+            </w:pPr>
+            <w:r>
+              <w:rPr>
+                <w:rFonts w:ascii="Arial" w:hAnsi="Arial"/>
+                <w:i w:val="0"/>
+                <w:color w:val="000000"/>
+                <w:sz w:val="21"/>
+              </w:rPr>
+              <w:t>Overdue, Damaged &amp; Lost Book</w:t>
+            </w:r>
+          </w:p>
+        </w:tc>
+        <w:tc>
+          <w:tcPr>
+            <w:tcW w:w="2088" w:type="dxa"/>
+            <w:shd w:val="clear" w:color="auto" w:fill="auto"/>
+            <w:vAlign w:val="center"/>
+          </w:tcPr>
+          <w:p>
+            <w:pPr>
+              <w:keepNext w:val="0"/>
+            </w:pPr>
+            <w:r>
+              <w:rPr>
+                <w:rFonts w:ascii="Arial" w:hAnsi="Arial"/>
+                <w:i w:val="0"/>
+                <w:color w:val="000000"/>
+                <w:sz w:val="21"/>
+              </w:rPr>
+              <w:t>27-10-2026</w:t>
+            </w:r>
+          </w:p>
+        </w:tc>
+        <w:tc>
+          <w:tcPr>
+            <w:tcW w:w="2088" w:type="dxa"/>
+          </w:tcPr>
+          <w:p>
+            <w:pPr>
+              <w:keepNext w:val="0"/>
+            </w:pPr>
+            <w:r>
+              <w:rPr>
+                <w:rFonts w:ascii="Arial" w:hAnsi="Arial"/>
+                <w:i w:val="0"/>
+                <w:color w:val="000000"/>
+                <w:sz w:val="21"/>
+              </w:rPr>
+              <w:t>31-10-2026</w:t>
+            </w:r>
+          </w:p>
+        </w:tc>
+      </w:tr>
+      <w:tr>
+        <w:trPr>
+          <w:trHeight w:val="264"/>
+          <w:cantSplit/>
+        </w:trPr>
+        <w:tc>
+          <w:tcPr>
+            <w:tcW w:w="4896" w:type="dxa"/>
+            <w:shd w:val="clear" w:color="auto" w:fill="auto"/>
+            <w:vAlign w:val="center"/>
+          </w:tcPr>
+          <w:p>
+            <w:pPr>
+              <w:keepNext w:val="0"/>
+            </w:pPr>
+            <w:r>
+              <w:rPr>
+                <w:rFonts w:ascii="Arial" w:hAnsi="Arial"/>
+                <w:i w:val="0"/>
+                <w:color w:val="000000"/>
+                <w:sz w:val="21"/>
+              </w:rPr>
+              <w:t>Reader Complaints &amp; Service Requests</w:t>
+            </w:r>
+          </w:p>
+        </w:tc>
+        <w:tc>
+          <w:tcPr>
+            <w:tcW w:w="2088" w:type="dxa"/>
+            <w:shd w:val="clear" w:color="auto" w:fill="auto"/>
+            <w:vAlign w:val="center"/>
+          </w:tcPr>
+          <w:p>
+            <w:pPr>
+              <w:keepNext w:val="0"/>
+            </w:pPr>
+            <w:r>
+              <w:rPr>
+                <w:rFonts w:ascii="Arial" w:hAnsi="Arial"/>
+                <w:i w:val="0"/>
+                <w:color w:val="000000"/>
+                <w:sz w:val="21"/>
+              </w:rPr>
+              <w:t>27-10-2026</w:t>
+            </w:r>
+          </w:p>
+        </w:tc>
+        <w:tc>
+          <w:tcPr>
+            <w:tcW w:w="2088" w:type="dxa"/>
+          </w:tcPr>
+          <w:p>
+            <w:pPr>
+              <w:keepNext w:val="0"/>
+            </w:pPr>
+            <w:r>
+              <w:rPr>
+                <w:rFonts w:ascii="Arial" w:hAnsi="Arial"/>
+                <w:i w:val="0"/>
+                <w:color w:val="000000"/>
+                <w:sz w:val="21"/>
+              </w:rPr>
+              <w:t>31-10-2026</w:t>
+            </w:r>
+          </w:p>
+        </w:tc>
+      </w:tr>
+      <w:tr>
+        <w:trPr>
+          <w:trHeight w:val="264"/>
+          <w:cantSplit/>
+        </w:trPr>
+        <w:tc>
+          <w:tcPr>
+            <w:tcW w:w="4896" w:type="dxa"/>
+            <w:shd w:val="clear" w:color="auto" w:fill="auto"/>
+            <w:vAlign w:val="center"/>
+          </w:tcPr>
+          <w:p>
+            <w:pPr>
+              <w:keepNext w:val="0"/>
+            </w:pPr>
+            <w:r>
+              <w:rPr>
+                <w:rFonts w:ascii="Arial" w:hAnsi="Arial"/>
+                <w:i w:val="0"/>
+                <w:color w:val="000000"/>
+                <w:sz w:val="21"/>
+              </w:rPr>
+              <w:t>Manage Books and Book Copies</w:t>
+            </w:r>
+          </w:p>
+        </w:tc>
+        <w:tc>
+          <w:tcPr>
+            <w:tcW w:w="2088" w:type="dxa"/>
+            <w:shd w:val="clear" w:color="auto" w:fill="auto"/>
+            <w:vAlign w:val="center"/>
+          </w:tcPr>
+          <w:p>
+            <w:pPr>
+              <w:keepNext w:val="0"/>
+            </w:pPr>
+            <w:r>
+              <w:rPr>
+                <w:rFonts w:ascii="Arial" w:hAnsi="Arial"/>
+                <w:i w:val="0"/>
+                <w:color w:val="000000"/>
+                <w:sz w:val="21"/>
+              </w:rPr>
+              <w:t>27-10-2026</w:t>
+            </w:r>
+          </w:p>
+        </w:tc>
+        <w:tc>
+          <w:tcPr>
+            <w:tcW w:w="2088" w:type="dxa"/>
+          </w:tcPr>
+          <w:p>
+            <w:pPr>
+              <w:keepNext w:val="0"/>
+            </w:pPr>
+            <w:r>
+              <w:rPr>
+                <w:rFonts w:ascii="Arial" w:hAnsi="Arial"/>
+                <w:i w:val="0"/>
+                <w:color w:val="000000"/>
+                <w:sz w:val="21"/>
+              </w:rPr>
+              <w:t>31-10-2026</w:t>
+            </w:r>
+          </w:p>
+        </w:tc>
+      </w:tr>
+      <w:tr>
+        <w:trPr>
+          <w:trHeight w:val="264"/>
+          <w:cantSplit/>
+        </w:trPr>
+        <w:tc>
+          <w:tcPr>
+            <w:tcW w:w="4896" w:type="dxa"/>
+            <w:shd w:val="clear" w:color="auto" w:fill="auto"/>
+            <w:vAlign w:val="center"/>
+          </w:tcPr>
+          <w:p>
+            <w:pPr>
+              <w:keepNext w:val="0"/>
+            </w:pPr>
+            <w:r>
+              <w:rPr>
+                <w:rFonts w:ascii="Arial" w:hAnsi="Arial"/>
+                <w:i w:val="0"/>
+                <w:color w:val="000000"/>
+                <w:sz w:val="21"/>
+              </w:rPr>
+              <w:t>Manage Book Import Tickets</w:t>
+            </w:r>
+          </w:p>
+        </w:tc>
+        <w:tc>
+          <w:tcPr>
+            <w:tcW w:w="2088" w:type="dxa"/>
+            <w:shd w:val="clear" w:color="auto" w:fill="auto"/>
+            <w:vAlign w:val="center"/>
+          </w:tcPr>
+          <w:p>
+            <w:pPr>
+              <w:keepNext w:val="0"/>
+            </w:pPr>
+            <w:r>
+              <w:rPr>
+                <w:rFonts w:ascii="Arial" w:hAnsi="Arial"/>
+                <w:i w:val="0"/>
+                <w:color w:val="000000"/>
+                <w:sz w:val="21"/>
+              </w:rPr>
+              <w:t>27-10-2026</w:t>
+            </w:r>
+          </w:p>
+        </w:tc>
+        <w:tc>
+          <w:tcPr>
+            <w:tcW w:w="2088" w:type="dxa"/>
+          </w:tcPr>
+          <w:p>
+            <w:pPr>
+              <w:keepNext w:val="0"/>
+            </w:pPr>
+            <w:r>
+              <w:rPr>
+                <w:rFonts w:ascii="Arial" w:hAnsi="Arial"/>
+                <w:i w:val="0"/>
+                <w:color w:val="000000"/>
+                <w:sz w:val="21"/>
+              </w:rPr>
+              <w:t>31-10-2026</w:t>
+            </w:r>
+          </w:p>
+        </w:tc>
+      </w:tr>
+      <w:tr>
+        <w:trPr>
+          <w:trHeight w:val="264"/>
+          <w:cantSplit/>
+        </w:trPr>
+        <w:tc>
+          <w:tcPr>
+            <w:tcW w:w="4896" w:type="dxa"/>
+            <w:shd w:val="clear" w:color="auto" w:fill="auto"/>
+            <w:vAlign w:val="center"/>
+          </w:tcPr>
+          <w:p>
+            <w:pPr>
+              <w:keepNext w:val="0"/>
+            </w:pPr>
+            <w:r>
+              <w:rPr>
+                <w:rFonts w:ascii="Arial" w:hAnsi="Arial"/>
+                <w:i w:val="0"/>
+                <w:color w:val="000000"/>
+                <w:sz w:val="21"/>
+              </w:rPr>
+              <w:t>Manage Fine</w:t>
+            </w:r>
+          </w:p>
+        </w:tc>
+        <w:tc>
+          <w:tcPr>
+            <w:tcW w:w="2088" w:type="dxa"/>
+            <w:shd w:val="clear" w:color="auto" w:fill="auto"/>
+            <w:vAlign w:val="center"/>
+          </w:tcPr>
+          <w:p>
+            <w:pPr>
+              <w:keepNext w:val="0"/>
+            </w:pPr>
+            <w:r>
+              <w:rPr>
+                <w:rFonts w:ascii="Arial" w:hAnsi="Arial"/>
+                <w:i w:val="0"/>
+                <w:color w:val="000000"/>
+                <w:sz w:val="21"/>
+              </w:rPr>
+              <w:t>27-10-2026</w:t>
+            </w:r>
+          </w:p>
+        </w:tc>
+        <w:tc>
+          <w:tcPr>
+            <w:tcW w:w="2088" w:type="dxa"/>
+          </w:tcPr>
+          <w:p>
+            <w:pPr>
+              <w:keepNext w:val="0"/>
+            </w:pPr>
+            <w:r>
+              <w:rPr>
+                <w:rFonts w:ascii="Arial" w:hAnsi="Arial"/>
+                <w:i w:val="0"/>
+                <w:color w:val="000000"/>
+                <w:sz w:val="21"/>
+              </w:rPr>
+              <w:t>31-10-2026</w:t>
+            </w:r>
+          </w:p>
+        </w:tc>
+      </w:tr>
+      <w:tr>
+        <w:trPr>
+          <w:trHeight w:val="264"/>
+          <w:cantSplit/>
+        </w:trPr>
+        <w:tc>
+          <w:tcPr>
+            <w:tcW w:w="4896" w:type="dxa"/>
+            <w:shd w:val="clear" w:color="auto" w:fill="auto"/>
+            <w:vAlign w:val="center"/>
+          </w:tcPr>
+          <w:p>
+            <w:pPr>
+              <w:keepNext w:val="0"/>
+            </w:pPr>
+            <w:r>
+              <w:rPr>
+                <w:rFonts w:ascii="Arial" w:hAnsi="Arial"/>
+                <w:i w:val="0"/>
+                <w:color w:val="000000"/>
+                <w:sz w:val="21"/>
+              </w:rPr>
+              <w:t>Send Reader Notifications</w:t>
+            </w:r>
+          </w:p>
+        </w:tc>
+        <w:tc>
+          <w:tcPr>
+            <w:tcW w:w="2088" w:type="dxa"/>
+            <w:shd w:val="clear" w:color="auto" w:fill="auto"/>
+            <w:vAlign w:val="center"/>
+          </w:tcPr>
+          <w:p>
+            <w:pPr>
+              <w:keepNext w:val="0"/>
+            </w:pPr>
+            <w:r>
+              <w:rPr>
+                <w:rFonts w:ascii="Arial" w:hAnsi="Arial"/>
+                <w:i w:val="0"/>
+                <w:color w:val="000000"/>
+                <w:sz w:val="21"/>
+              </w:rPr>
+              <w:t>27-10-2026</w:t>
+            </w:r>
+          </w:p>
+        </w:tc>
+        <w:tc>
+          <w:tcPr>
+            <w:tcW w:w="2088" w:type="dxa"/>
+          </w:tcPr>
+          <w:p>
+            <w:pPr>
+              <w:keepNext w:val="0"/>
+            </w:pPr>
+            <w:r>
+              <w:rPr>
+                <w:rFonts w:ascii="Arial" w:hAnsi="Arial"/>
+                <w:i w:val="0"/>
+                <w:color w:val="000000"/>
+                <w:sz w:val="21"/>
+              </w:rPr>
+              <w:t>31-10-2026</w:t>
+            </w:r>
+          </w:p>
+        </w:tc>
+      </w:tr>
+      <w:tr>
+        <w:trPr>
+          <w:trHeight w:val="264"/>
+          <w:cantSplit/>
+        </w:trPr>
+        <w:tc>
+          <w:tcPr>
+            <w:tcW w:w="4896" w:type="dxa"/>
+            <w:shd w:val="clear" w:color="auto" w:fill="auto"/>
+            <w:vAlign w:val="center"/>
+          </w:tcPr>
+          <w:p>
+            <w:pPr>
+              <w:keepNext w:val="0"/>
+            </w:pPr>
+            <w:r>
+              <w:rPr>
+                <w:rFonts w:ascii="Arial" w:hAnsi="Arial"/>
+                <w:i w:val="0"/>
+                <w:color w:val="000000"/>
+                <w:sz w:val="21"/>
+              </w:rPr>
+              <w:t>View Book Demand Report</w:t>
+            </w:r>
+          </w:p>
+        </w:tc>
+        <w:tc>
+          <w:tcPr>
+            <w:tcW w:w="2088" w:type="dxa"/>
+            <w:shd w:val="clear" w:color="auto" w:fill="auto"/>
+            <w:vAlign w:val="center"/>
+          </w:tcPr>
+          <w:p>
+            <w:pPr>
+              <w:keepNext w:val="0"/>
+            </w:pPr>
+            <w:r>
+              <w:rPr>
+                <w:rFonts w:ascii="Arial" w:hAnsi="Arial"/>
+                <w:i w:val="0"/>
+                <w:color w:val="000000"/>
+                <w:sz w:val="21"/>
+              </w:rPr>
+              <w:t>27-10-2026</w:t>
+            </w:r>
+          </w:p>
+        </w:tc>
+        <w:tc>
+          <w:tcPr>
+            <w:tcW w:w="2088" w:type="dxa"/>
+          </w:tcPr>
+          <w:p>
+            <w:pPr>
+              <w:keepNext w:val="0"/>
+            </w:pPr>
+            <w:r>
+              <w:rPr>
+                <w:rFonts w:ascii="Arial" w:hAnsi="Arial"/>
+                <w:i w:val="0"/>
+                <w:color w:val="000000"/>
+                <w:sz w:val="21"/>
+              </w:rPr>
+              <w:t>31-10-2026</w:t>
+            </w:r>
+          </w:p>
+        </w:tc>
+      </w:tr>
+      <w:tr>
+        <w:trPr>
+          <w:trHeight w:val="264"/>
+          <w:cantSplit/>
+        </w:trPr>
+        <w:tc>
+          <w:tcPr>
+            <w:tcW w:w="4896" w:type="dxa"/>
+            <w:shd w:val="clear" w:color="auto" w:fill="auto"/>
+            <w:vAlign w:val="center"/>
+          </w:tcPr>
+          <w:p>
+            <w:pPr>
+              <w:keepNext w:val="0"/>
+            </w:pPr>
+            <w:r>
+              <w:rPr>
+                <w:rFonts w:ascii="Arial" w:hAnsi="Arial"/>
+                <w:i w:val="0"/>
+                <w:color w:val="000000"/>
+                <w:sz w:val="21"/>
+              </w:rPr>
+              <w:t>Manage Users</w:t>
+            </w:r>
+          </w:p>
+        </w:tc>
+        <w:tc>
+          <w:tcPr>
+            <w:tcW w:w="2088" w:type="dxa"/>
+            <w:shd w:val="clear" w:color="auto" w:fill="auto"/>
+            <w:vAlign w:val="center"/>
+          </w:tcPr>
+          <w:p>
+            <w:pPr>
+              <w:keepNext w:val="0"/>
+            </w:pPr>
+            <w:r>
+              <w:rPr>
+                <w:rFonts w:ascii="Arial" w:hAnsi="Arial"/>
+                <w:i w:val="0"/>
+                <w:color w:val="000000"/>
+                <w:sz w:val="21"/>
+              </w:rPr>
+              <w:t>27-10-2026</w:t>
+            </w:r>
+          </w:p>
+        </w:tc>
+        <w:tc>
+          <w:tcPr>
+            <w:tcW w:w="2088" w:type="dxa"/>
+          </w:tcPr>
+          <w:p>
+            <w:pPr>
+              <w:keepNext w:val="0"/>
+            </w:pPr>
+            <w:r>
+              <w:rPr>
+                <w:rFonts w:ascii="Arial" w:hAnsi="Arial"/>
+                <w:i w:val="0"/>
+                <w:color w:val="000000"/>
+                <w:sz w:val="21"/>
+              </w:rPr>
+              <w:t>31-10-2026</w:t>
+            </w:r>
+          </w:p>
+        </w:tc>
+      </w:tr>
+      <w:tr>
+        <w:trPr>
+          <w:trHeight w:val="264"/>
+          <w:cantSplit/>
+        </w:trPr>
+        <w:tc>
+          <w:tcPr>
+            <w:tcW w:w="4896" w:type="dxa"/>
+            <w:shd w:val="clear" w:color="auto" w:fill="auto"/>
+            <w:vAlign w:val="center"/>
+          </w:tcPr>
+          <w:p>
+            <w:pPr>
+              <w:keepNext w:val="0"/>
+            </w:pPr>
+            <w:r>
+              <w:rPr>
+                <w:rFonts w:ascii="Arial" w:hAnsi="Arial"/>
+                <w:i w:val="0"/>
+                <w:color w:val="000000"/>
+                <w:sz w:val="21"/>
+              </w:rPr>
+              <w:t>View Roles &amp; Permissions</w:t>
+            </w:r>
+          </w:p>
+        </w:tc>
+        <w:tc>
+          <w:tcPr>
+            <w:tcW w:w="2088" w:type="dxa"/>
+            <w:shd w:val="clear" w:color="auto" w:fill="auto"/>
+            <w:vAlign w:val="center"/>
+          </w:tcPr>
+          <w:p>
+            <w:pPr>
+              <w:keepNext w:val="0"/>
+            </w:pPr>
+            <w:r>
+              <w:rPr>
+                <w:rFonts w:ascii="Arial" w:hAnsi="Arial"/>
+                <w:i w:val="0"/>
+                <w:color w:val="000000"/>
+                <w:sz w:val="21"/>
+              </w:rPr>
+              <w:t>27-10-2026</w:t>
+            </w:r>
+          </w:p>
+        </w:tc>
+        <w:tc>
+          <w:tcPr>
+            <w:tcW w:w="2088" w:type="dxa"/>
+          </w:tcPr>
+          <w:p>
+            <w:pPr>
+              <w:keepNext w:val="0"/>
+            </w:pPr>
+            <w:r>
+              <w:rPr>
+                <w:rFonts w:ascii="Arial" w:hAnsi="Arial"/>
+                <w:i w:val="0"/>
+                <w:color w:val="000000"/>
+                <w:sz w:val="21"/>
+              </w:rPr>
+              <w:t>31-10-2026</w:t>
+            </w:r>
+          </w:p>
+        </w:tc>
+      </w:tr>
+      <w:tr>
+        <w:trPr>
+          <w:trHeight w:val="264"/>
+          <w:cantSplit/>
+        </w:trPr>
+        <w:tc>
+          <w:tcPr>
+            <w:tcW w:w="4896" w:type="dxa"/>
+            <w:shd w:val="clear" w:color="auto" w:fill="auto"/>
+            <w:vAlign w:val="center"/>
+          </w:tcPr>
+          <w:p>
+            <w:pPr>
+              <w:keepNext w:val="0"/>
+            </w:pPr>
+            <w:r>
+              <w:rPr>
+                <w:rFonts w:ascii="Arial" w:hAnsi="Arial"/>
+                <w:i w:val="0"/>
+                <w:color w:val="000000"/>
+                <w:sz w:val="21"/>
+              </w:rPr>
+              <w:t>Manage Policies &amp; Regulations</w:t>
+            </w:r>
+          </w:p>
+        </w:tc>
+        <w:tc>
+          <w:tcPr>
+            <w:tcW w:w="2088" w:type="dxa"/>
+            <w:shd w:val="clear" w:color="auto" w:fill="auto"/>
+            <w:vAlign w:val="center"/>
+          </w:tcPr>
+          <w:p>
+            <w:pPr>
+              <w:keepNext w:val="0"/>
+            </w:pPr>
+            <w:r>
+              <w:rPr>
+                <w:rFonts w:ascii="Arial" w:hAnsi="Arial"/>
+                <w:i w:val="0"/>
+                <w:color w:val="000000"/>
+                <w:sz w:val="21"/>
+              </w:rPr>
+              <w:t>27-10-2026</w:t>
+            </w:r>
+          </w:p>
+        </w:tc>
+        <w:tc>
+          <w:tcPr>
+            <w:tcW w:w="2088" w:type="dxa"/>
+          </w:tcPr>
+          <w:p>
+            <w:pPr>
+              <w:keepNext w:val="0"/>
+            </w:pPr>
+            <w:r>
+              <w:rPr>
+                <w:rFonts w:ascii="Arial" w:hAnsi="Arial"/>
+                <w:i w:val="0"/>
+                <w:color w:val="000000"/>
+                <w:sz w:val="21"/>
+              </w:rPr>
+              <w:t>31-10-2026</w:t>
+            </w:r>
+          </w:p>
+        </w:tc>
+      </w:tr>
+      <w:tr>
+        <w:trPr>
+          <w:trHeight w:val="264"/>
+          <w:cantSplit/>
+        </w:trPr>
+        <w:tc>
+          <w:tcPr>
+            <w:tcW w:w="4896" w:type="dxa"/>
+            <w:shd w:val="clear" w:color="auto" w:fill="auto"/>
+            <w:vAlign w:val="center"/>
+          </w:tcPr>
+          <w:p>
+            <w:pPr>
+              <w:keepNext w:val="0"/>
+            </w:pPr>
+            <w:r>
+              <w:rPr>
+                <w:rFonts w:ascii="Arial" w:hAnsi="Arial"/>
+                <w:i w:val="0"/>
+                <w:color w:val="000000"/>
+                <w:sz w:val="21"/>
+              </w:rPr>
+              <w:t>Manage AI Services</w:t>
+            </w:r>
+          </w:p>
+        </w:tc>
+        <w:tc>
+          <w:tcPr>
+            <w:tcW w:w="2088" w:type="dxa"/>
+            <w:shd w:val="clear" w:color="auto" w:fill="auto"/>
+            <w:vAlign w:val="center"/>
+          </w:tcPr>
+          <w:p>
+            <w:pPr>
+              <w:keepNext w:val="0"/>
+            </w:pPr>
+            <w:r>
+              <w:rPr>
+                <w:rFonts w:ascii="Arial" w:hAnsi="Arial"/>
+                <w:i w:val="0"/>
+                <w:color w:val="000000"/>
+                <w:sz w:val="21"/>
+              </w:rPr>
+              <w:t>27-10-2026</w:t>
+            </w:r>
+          </w:p>
+        </w:tc>
+        <w:tc>
+          <w:tcPr>
+            <w:tcW w:w="2088" w:type="dxa"/>
+          </w:tcPr>
+          <w:p>
+            <w:pPr>
+              <w:keepNext w:val="0"/>
+            </w:pPr>
+            <w:r>
+              <w:rPr>
+                <w:rFonts w:ascii="Arial" w:hAnsi="Arial"/>
+                <w:i w:val="0"/>
+                <w:color w:val="000000"/>
+                <w:sz w:val="21"/>
+              </w:rPr>
+              <w:t>31-10-2026</w:t>
+            </w:r>
+          </w:p>
+        </w:tc>
+      </w:tr>
+      <w:tr>
+        <w:trPr>
+          <w:trHeight w:val="264"/>
+          <w:cantSplit/>
+        </w:trPr>
+        <w:tc>
+          <w:tcPr>
+            <w:tcW w:w="4896" w:type="dxa"/>
+            <w:shd w:val="clear" w:color="auto" w:fill="auto"/>
+            <w:vAlign w:val="center"/>
+          </w:tcPr>
+          <w:p>
+            <w:pPr>
+              <w:keepNext w:val="0"/>
+            </w:pPr>
+            <w:r>
+              <w:rPr>
+                <w:rFonts w:ascii="Arial" w:hAnsi="Arial"/>
+                <w:i w:val="0"/>
+                <w:color w:val="000000"/>
+                <w:sz w:val="21"/>
+              </w:rPr>
+              <w:t>View Statistics &amp; Generate Reports</w:t>
+            </w:r>
+          </w:p>
+        </w:tc>
+        <w:tc>
+          <w:tcPr>
+            <w:tcW w:w="2088" w:type="dxa"/>
+            <w:shd w:val="clear" w:color="auto" w:fill="auto"/>
+            <w:vAlign w:val="center"/>
+          </w:tcPr>
+          <w:p>
+            <w:pPr>
+              <w:keepNext w:val="0"/>
+            </w:pPr>
+            <w:r>
+              <w:rPr>
+                <w:rFonts w:ascii="Arial" w:hAnsi="Arial"/>
+                <w:i w:val="0"/>
+                <w:color w:val="000000"/>
+                <w:sz w:val="21"/>
+              </w:rPr>
+              <w:t>27-10-2026</w:t>
+            </w:r>
+          </w:p>
+        </w:tc>
+        <w:tc>
+          <w:tcPr>
+            <w:tcW w:w="2088" w:type="dxa"/>
+          </w:tcPr>
+          <w:p>
+            <w:pPr>
+              <w:keepNext w:val="0"/>
+            </w:pPr>
+            <w:r>
+              <w:rPr>
+                <w:rFonts w:ascii="Arial" w:hAnsi="Arial"/>
+                <w:i w:val="0"/>
+                <w:color w:val="000000"/>
+                <w:sz w:val="21"/>
+              </w:rPr>
+              <w:t>31-10-2026</w:t>
+            </w:r>
+          </w:p>
+        </w:tc>
+      </w:tr>
+      <w:tr>
+        <w:trPr>
+          <w:trHeight w:val="264"/>
+          <w:cantSplit/>
+        </w:trPr>
+        <w:tc>
+          <w:tcPr>
+            <w:tcW w:w="4896" w:type="dxa"/>
+            <w:shd w:val="clear" w:color="auto" w:fill="auto"/>
+            <w:vAlign w:val="center"/>
+          </w:tcPr>
+          <w:p>
+            <w:pPr>
+              <w:keepNext w:val="0"/>
+            </w:pPr>
+            <w:r>
+              <w:rPr>
+                <w:rFonts w:ascii="Arial" w:hAnsi="Arial"/>
+                <w:i w:val="0"/>
+                <w:color w:val="000000"/>
+                <w:sz w:val="21"/>
+              </w:rPr>
+              <w:t>Analyze Book Demand</w:t>
+            </w:r>
+          </w:p>
+        </w:tc>
+        <w:tc>
+          <w:tcPr>
+            <w:tcW w:w="2088" w:type="dxa"/>
+            <w:shd w:val="clear" w:color="auto" w:fill="auto"/>
+            <w:vAlign w:val="center"/>
+          </w:tcPr>
+          <w:p>
+            <w:pPr>
+              <w:keepNext w:val="0"/>
+            </w:pPr>
+            <w:r>
+              <w:rPr>
+                <w:rFonts w:ascii="Arial" w:hAnsi="Arial"/>
+                <w:i w:val="0"/>
+                <w:color w:val="000000"/>
+                <w:sz w:val="21"/>
+              </w:rPr>
+              <w:t>27-10-2026</w:t>
+            </w:r>
+          </w:p>
+        </w:tc>
+        <w:tc>
+          <w:tcPr>
+            <w:tcW w:w="2088" w:type="dxa"/>
+          </w:tcPr>
+          <w:p>
+            <w:pPr>
+              <w:keepNext w:val="0"/>
+            </w:pPr>
+            <w:r>
+              <w:rPr>
+                <w:rFonts w:ascii="Arial" w:hAnsi="Arial"/>
+                <w:i w:val="0"/>
+                <w:color w:val="000000"/>
+                <w:sz w:val="21"/>
+              </w:rPr>
+              <w:t>31-10-2026</w:t>
+            </w:r>
+          </w:p>
+        </w:tc>
+      </w:tr>
+      <w:tr>
+        <w:trPr>
+          <w:trHeight w:val="264"/>
+          <w:cantSplit/>
+        </w:trPr>
+        <w:tc>
+          <w:tcPr>
+            <w:tcW w:w="4896" w:type="dxa"/>
+            <w:shd w:val="clear" w:color="auto" w:fill="auto"/>
+            <w:vAlign w:val="center"/>
+          </w:tcPr>
+          <w:p>
+            <w:pPr>
+              <w:keepNext w:val="0"/>
+            </w:pPr>
+            <w:r>
+              <w:rPr>
+                <w:rFonts w:ascii="Arial" w:hAnsi="Arial"/>
+                <w:i w:val="0"/>
+                <w:color w:val="000000"/>
+                <w:sz w:val="21"/>
+              </w:rPr>
+              <w:t>Generate Book Recommendations</w:t>
+            </w:r>
+          </w:p>
+        </w:tc>
+        <w:tc>
+          <w:tcPr>
+            <w:tcW w:w="2088" w:type="dxa"/>
+            <w:shd w:val="clear" w:color="auto" w:fill="auto"/>
+            <w:vAlign w:val="center"/>
+          </w:tcPr>
+          <w:p>
+            <w:pPr>
+              <w:keepNext w:val="0"/>
+            </w:pPr>
+            <w:r>
+              <w:rPr>
+                <w:rFonts w:ascii="Arial" w:hAnsi="Arial"/>
+                <w:i w:val="0"/>
+                <w:color w:val="000000"/>
+                <w:sz w:val="21"/>
+              </w:rPr>
+              <w:t>27-10-2026</w:t>
+            </w:r>
+          </w:p>
+        </w:tc>
+        <w:tc>
+          <w:tcPr>
+            <w:tcW w:w="2088" w:type="dxa"/>
+          </w:tcPr>
+          <w:p>
+            <w:pPr>
+              <w:keepNext w:val="0"/>
+            </w:pPr>
+            <w:r>
+              <w:rPr>
+                <w:rFonts w:ascii="Arial" w:hAnsi="Arial"/>
+                <w:i w:val="0"/>
+                <w:color w:val="000000"/>
+                <w:sz w:val="21"/>
+              </w:rPr>
+              <w:t>31-10-2026</w:t>
+            </w:r>
+          </w:p>
+        </w:tc>
+      </w:tr>
+      <w:tr>
+        <w:trPr>
+          <w:trHeight w:val="264"/>
+          <w:cantSplit/>
+        </w:trPr>
+        <w:tc>
+          <w:tcPr>
+            <w:tcW w:w="4896" w:type="dxa"/>
+            <w:shd w:val="clear" w:color="auto" w:fill="auto"/>
+            <w:vAlign w:val="center"/>
+          </w:tcPr>
+          <w:p>
+            <w:pPr>
+              <w:keepNext w:val="0"/>
+            </w:pPr>
+            <w:r>
+              <w:rPr>
+                <w:rFonts w:ascii="Arial" w:hAnsi="Arial"/>
+                <w:i w:val="0"/>
+                <w:color w:val="000000"/>
+                <w:sz w:val="21"/>
+              </w:rPr>
+              <w:t>Search Books Using AI</w:t>
+            </w:r>
+          </w:p>
+        </w:tc>
+        <w:tc>
+          <w:tcPr>
+            <w:tcW w:w="2088" w:type="dxa"/>
+            <w:shd w:val="clear" w:color="auto" w:fill="auto"/>
+            <w:vAlign w:val="center"/>
+          </w:tcPr>
+          <w:p>
+            <w:pPr>
+              <w:keepNext w:val="0"/>
+            </w:pPr>
+            <w:r>
+              <w:rPr>
+                <w:rFonts w:ascii="Arial" w:hAnsi="Arial"/>
+                <w:i w:val="0"/>
+                <w:color w:val="000000"/>
+                <w:sz w:val="21"/>
+              </w:rPr>
+              <w:t>27-10-2026</w:t>
+            </w:r>
+          </w:p>
+        </w:tc>
+        <w:tc>
+          <w:tcPr>
+            <w:tcW w:w="2088" w:type="dxa"/>
+          </w:tcPr>
+          <w:p>
+            <w:pPr>
+              <w:keepNext w:val="0"/>
+            </w:pPr>
+            <w:r>
+              <w:rPr>
+                <w:rFonts w:ascii="Arial" w:hAnsi="Arial"/>
+                <w:i w:val="0"/>
+                <w:color w:val="000000"/>
+                <w:sz w:val="21"/>
+              </w:rPr>
+              <w:t>31-10-2026</w:t>
             </w:r>
           </w:p>
         </w:tc>
@@ -4017,7 +6383,7 @@
           <w:color w:val="000000"/>
           <w:sz w:val="22"/>
         </w:rPr>
-        <w:t>Other cases: Report5_Test Report.xlsx — 87 entries: 21 Passed / 1 Failed / 65 Not Tested. The inventory includes 21 integration cases (three skipped), four local NFR scenarios and 62 planned system/E2E/state scenarios. The four local checks are measured against a proposed criterion, not SRS acceptance. The workbook also contains the feature inventory, workflows, 40-use-case RTM, unit traceability and defect register.</w:t>
+        <w:t>Other cases: Report5_Test Report.xlsx — 87 entries: 42 Passed / 3 Failed / 42 Not Tested. The inventory includes 21 baseline integration cases, four local NFR scenarios and 62 system/E2E/state scenarios, some now executed at API level. Partial scenarios remain Not Tested. Local NFR checks use a proposed criterion, not SRS acceptance. The workbook contains feature statistics, workflows, RTM and defects.</w:t>
       </w:r>
     </w:p>
     <w:p>
@@ -4199,7 +6565,31 @@
           <w:color w:val="000000"/>
           <w:sz w:val="22"/>
         </w:rPr>
-        <w:t>The RTM maps UC01–UC40 to candidate feature groups, implementation references, test IDs and saved evidence. UC18 is Fail due to R5-DEF-001. Other use cases remain Not Tested at full-requirement acceptance level because only parts of their behavior have executed evidence. Per-case Passed results remain visible. Unit traceability is supporting module-level evidence, not a claim that an entire UC is verified.</w:t>
+        <w:t>The targeted follow-up run is preserved in evidence/planned-api/planned-api.trx: 24 tests, 22 Passed and 2 Failed. One passing API test covers only part of ST-10-2, so that report case remains Not Tested. Reused workflow helpers are identified in source; these are not 24 independent new features and do not establish browser coverage.</w:t>
+      </w:r>
+    </w:p>
+    <w:p>
+      <w:pPr/>
+      <w:r>
+        <w:rPr>
+          <w:rFonts w:ascii="Arial" w:hAnsi="Arial"/>
+          <w:i w:val="0"/>
+          <w:color w:val="000000"/>
+          <w:sz w:val="22"/>
+        </w:rPr>
+        <w:t>R5-DEF-002 — Reader can create catalog inventory through POST /api/v1/books/form. Status: Open / Fail. Severity: High proposed. Authenticate as Reader, submit a unique alphanumeric Code, Title and TotalCopies=1. Expected: HTTP 403 and no inserted book. Actual: HTTP 201 and persisted=True, asserted against the isolated DB. The JSON create/update/intake routes reject Reader; the form endpoint has only general authentication. No business fix was applied.</w:t>
+      </w:r>
+    </w:p>
+    <w:p>
+      <w:pPr/>
+      <w:r>
+        <w:rPr>
+          <w:rFonts w:ascii="Arial" w:hAnsi="Arial"/>
+          <w:i w:val="0"/>
+          <w:color w:val="000000"/>
+          <w:sz w:val="22"/>
+        </w:rPr>
+        <w:t>The RTM maps UC01–UC40 to candidate feature groups, implementation references, test IDs and saved evidence. UC18 is Fail due to R5-DEF-001; UC28 is Fail due to R5-DEF-002. Other use cases remain Not Tested at full-requirement acceptance level. Per-case Passed results remain visible. Unit traceability is supporting module-level evidence, not proof of a whole UC.</w:t>
       </w:r>
     </w:p>
     <w:p>

</xml_diff>